<commit_message>
Add author details to title page and cover letter
</commit_message>
<xml_diff>
--- a/revision/06b_cover_letter.docx
+++ b/revision/06b_cover_letter.docx
@@ -100,19 +100,13 @@
         <w:pStyle w:val="BodyText"/>
       </w:pPr>
       <w:r>
-        <w:t xml:space="preserve">Quang-Vinh Dang</w:t>
+        <w:t xml:space="preserve">Quang-Vinh Dang (corresponding author), British University Vietnam, vinh.dq4@buv.edu.vn</w:t>
       </w:r>
       <w:r>
         <w:t xml:space="preserve"> </w:t>
       </w:r>
       <w:r>
-        <w:t xml:space="preserve">British University Vietnam</w:t>
-      </w:r>
-      <w:r>
-        <w:t xml:space="preserve"> </w:t>
-      </w:r>
-      <w:r>
-        <w:t xml:space="preserve">vinh.dq4@buv.edu.vn</w:t>
+        <w:t xml:space="preserve">Thi-Hong-Hanh Nguyen, Banking Academy of Vietnam, hanh.nth1@hvnh.edu.vn</w:t>
       </w:r>
     </w:p>
     <w:sectPr/>

</xml_diff>